<commit_message>
Regulatory watcher archive: 2026-04-06
</commit_message>
<xml_diff>
--- a/history/registers/regulatory-updates/2026-04-06.docx
+++ b/history/registers/regulatory-updates/2026-04-06.docx
@@ -264,43 +264,43 @@
           <w:rFonts w:ascii="Courier New" w:hAnsi="Courier New" w:cs="Courier New"/>
           <w:sz w:val="20"/>
         </w:rPr>
-        <w:t xml:space="preserve">Source                                         Authority                            Status  URL                                             </w:t>
-      </w:r>
-    </w:p>
-    <w:p>
-      <w:pPr>
-        <w:spacing w:after="0"/>
-      </w:pPr>
-      <w:r>
-        <w:rPr>
-          <w:rFonts w:ascii="Courier New" w:hAnsi="Courier New" w:cs="Courier New"/>
-          <w:sz w:val="20"/>
-        </w:rPr>
-        <w:t xml:space="preserve">---------------------------------------------  -----------------------------------  ------  ------------------------------------------------</w:t>
-      </w:r>
-    </w:p>
-    <w:p>
-      <w:pPr>
-        <w:spacing w:after="0"/>
-      </w:pPr>
-      <w:r>
-        <w:rPr>
-          <w:rFonts w:ascii="Courier New" w:hAnsi="Courier New" w:cs="Courier New"/>
-          <w:sz w:val="20"/>
-        </w:rPr>
-        <w:t xml:space="preserve">Ministry of Economy — AML supervision pages    Ministry of Economy                  new     https://www.moec.gov.ae/en/anti-money-laundering</w:t>
-      </w:r>
-    </w:p>
-    <w:p>
-      <w:pPr>
-        <w:spacing w:after="0"/>
-      </w:pPr>
-      <w:r>
-        <w:rPr>
-          <w:rFonts w:ascii="Courier New" w:hAnsi="Courier New" w:cs="Courier New"/>
-          <w:sz w:val="20"/>
-        </w:rPr>
-        <w:t xml:space="preserve">Executive Office for Control and Non-Prolife…  Executive Office for Control and N…  new     https://www.uaeiec.gov.ae/en-us/                </w:t>
+        <w:t xml:space="preserve">Source                                         Authority                            Status   URL                                             </w:t>
+      </w:r>
+    </w:p>
+    <w:p>
+      <w:pPr>
+        <w:spacing w:after="0"/>
+      </w:pPr>
+      <w:r>
+        <w:rPr>
+          <w:rFonts w:ascii="Courier New" w:hAnsi="Courier New" w:cs="Courier New"/>
+          <w:sz w:val="20"/>
+        </w:rPr>
+        <w:t xml:space="preserve">---------------------------------------------  -----------------------------------  -------  ------------------------------------------------</w:t>
+      </w:r>
+    </w:p>
+    <w:p>
+      <w:pPr>
+        <w:spacing w:after="0"/>
+      </w:pPr>
+      <w:r>
+        <w:rPr>
+          <w:rFonts w:ascii="Courier New" w:hAnsi="Courier New" w:cs="Courier New"/>
+          <w:sz w:val="20"/>
+        </w:rPr>
+        <w:t xml:space="preserve">Ministry of Economy — AML supervision pages    Ministry of Economy                  changed  https://www.moec.gov.ae/en/anti-money-laundering</w:t>
+      </w:r>
+    </w:p>
+    <w:p>
+      <w:pPr>
+        <w:spacing w:after="0"/>
+      </w:pPr>
+      <w:r>
+        <w:rPr>
+          <w:rFonts w:ascii="Courier New" w:hAnsi="Courier New" w:cs="Courier New"/>
+          <w:sz w:val="20"/>
+        </w:rPr>
+        <w:t xml:space="preserve">Executive Office for Control and Non-Prolife…  Executive Office for Control and N…  changed  https://www.uaeiec.gov.ae/en-us/                </w:t>
       </w:r>
     </w:p>
     <w:p>

</xml_diff>